<commit_message>
Update development directory to latest baseline
</commit_message>
<xml_diff>
--- a/docs/01_requirements/GridSenpAI_SRS.docx
+++ b/docs/01_requirements/GridSenpAI_SRS.docx
@@ -4,23 +4,66 @@
   <w:body>
     <w:p>
       <w:pPr>
-        <w:pStyle w:val="Title"/>
-      </w:pPr>
-      <w:proofErr w:type="spellStart"/>
-      <w:r>
+        <w:jc w:val="center"/>
+      </w:pPr>
+      <w:r>
+        <w:rPr>
+          <w:b/>
+          <w:color w:val="1F4E79"/>
+          <w:sz w:val="44"/>
+        </w:rPr>
         <w:t>GridSenpAI</w:t>
       </w:r>
-      <w:proofErr w:type="spellEnd"/>
-      <w:r>
-        <w:t xml:space="preserve"> Software Requirements Specification (</w:t>
-      </w:r>
-      <w:proofErr w:type="gramStart"/>
-      <w:r>
-        <w:t>SRS) —</w:t>
-      </w:r>
-      <w:proofErr w:type="gramEnd"/>
-      <w:r>
-        <w:t xml:space="preserve"> Watson Implementation Notes Included</w:t>
+    </w:p>
+    <w:p>
+      <w:pPr>
+        <w:jc w:val="center"/>
+      </w:pPr>
+      <w:r>
+        <w:rPr>
+          <w:b/>
+          <w:sz w:val="36"/>
+        </w:rPr>
+        <w:t>Software Requirements Specification (SRS)</w:t>
+      </w:r>
+    </w:p>
+    <w:p/>
+    <w:p>
+      <w:pPr>
+        <w:jc w:val="center"/>
+      </w:pPr>
+    </w:p>
+    <w:p>
+      <w:pPr>
+        <w:jc w:val="center"/>
+      </w:pPr>
+      <w:r>
+        <w:t>Version: 2.5</w:t>
+      </w:r>
+    </w:p>
+    <w:p>
+      <w:pPr>
+        <w:jc w:val="center"/>
+      </w:pPr>
+      <w:r>
+        <w:t>Date: March 2026</w:t>
+      </w:r>
+    </w:p>
+    <w:p/>
+    <w:p>
+      <w:pPr>
+        <w:jc w:val="center"/>
+      </w:pPr>
+      <w:r>
+        <w:rPr>
+          <w:i/>
+        </w:rPr>
+        <w:t>This revision preserves the original system scope while incorporating structured interview intake, canonical facility state, interconnection artifact coverage, and bounded LLM co-pilot behavior.</w:t>
+      </w:r>
+    </w:p>
+    <w:p>
+      <w:r>
+        <w:br w:type="page"/>
       </w:r>
     </w:p>
     <w:p>
@@ -28,40 +71,12 @@
         <w:pStyle w:val="Heading1"/>
       </w:pPr>
       <w:r>
+        <w:lastRenderedPageBreak/>
         <w:t>1. Introduction</w:t>
       </w:r>
     </w:p>
     <w:p>
       <w:pPr>
-        <w:spacing w:after="120"/>
-      </w:pPr>
-      <w:proofErr w:type="spellStart"/>
-      <w:r>
-        <w:t>GridSenpAI</w:t>
-      </w:r>
-      <w:proofErr w:type="spellEnd"/>
-      <w:r>
-        <w:t xml:space="preserve"> is an AI-assisted engineering translation system designed to bridge the gap between data center electrical facility designs and the modeling requirements of transmission planners (TPs). The system ingests facility electrical design information and equipment specifications and produces grid-study-ready modeling parameters compatible with transmission planning simulation tools (e.g., PSS/E, PSLF, </w:t>
-      </w:r>
-      <w:proofErr w:type="spellStart"/>
-      <w:r>
-        <w:t>PowerWorld</w:t>
-      </w:r>
-      <w:proofErr w:type="spellEnd"/>
-      <w:r>
-        <w:t>).</w:t>
-      </w:r>
-    </w:p>
-    <w:p>
-      <w:pPr>
-        <w:spacing w:after="120"/>
-      </w:pPr>
-      <w:r>
-        <w:t>This SRS is written to be platform-aware: wherever an implementation component can map to an IBM Watson capability, the applicable IBM product is noted in parentheses next to the agnostic term.</w:t>
-      </w:r>
-    </w:p>
-    <w:p>
-      <w:pPr>
         <w:pStyle w:val="Heading2"/>
       </w:pPr>
       <w:r>
@@ -69,19 +84,8 @@
       </w:r>
     </w:p>
     <w:p>
-      <w:pPr>
-        <w:spacing w:after="120"/>
-      </w:pPr>
-      <w:r>
-        <w:t xml:space="preserve">Define functional and non-functional requirements for </w:t>
-      </w:r>
-      <w:proofErr w:type="spellStart"/>
-      <w:r>
-        <w:t>GridSenpAI</w:t>
-      </w:r>
-      <w:proofErr w:type="spellEnd"/>
-      <w:r>
-        <w:t xml:space="preserve"> so engineering teams can build, test, deploy, and operate the system.</w:t>
+      <w:r>
+        <w:t>This Software Requirements Specification (SRS) defines the functional and non-functional requirements for GridSenpAI, an AI-assisted engineering translation system that converts large-load facility documentation and data collected through a governed interactive interview process into modeling parameters used by transmission planners during interconnection analysis and grid studies.</w:t>
       </w:r>
     </w:p>
     <w:p>
@@ -93,19 +97,13 @@
       </w:r>
     </w:p>
     <w:p>
-      <w:pPr>
-        <w:spacing w:after="120"/>
-      </w:pPr>
-      <w:r>
-        <w:t>In scope: ingestion of facility artifacts, specification retrieval, parameter extraction, translation to TP-ready model parameters, packaging/export, traceability, confidence tagging, and a validation loop for iterative model refinement.</w:t>
-      </w:r>
-    </w:p>
-    <w:p>
-      <w:pPr>
-        <w:spacing w:after="120"/>
-      </w:pPr>
-      <w:r>
-        <w:t>Out of scope (initial release): direct integration into TP proprietary simulators via plug-ins; real-time closed-loop control; automated approval/decision-making in interconnection queues.</w:t>
+      <w:r>
+        <w:t>In scope for the initial release are ingestion of facility and interconnection artifacts; structured interview intake; extraction of engineering entities and topology cues; retrieval of vendor, standards, and modeling references; normalization into a unified canonical facility state; translation into planner-ready model parameters; scenario generation; packaging and export; traceability; confidence tagging; and a validation loop for iterative model refinement.</w:t>
+      </w:r>
+    </w:p>
+    <w:p>
+      <w:r>
+        <w:t>Out of scope for the initial release are direct plug-in integration with proprietary transmission planning simulators, real-time closed-loop control of facility equipment, and automated approval or decision-making within utility or ISO interconnection queues.</w:t>
       </w:r>
     </w:p>
     <w:p>
@@ -118,52 +116,99 @@
     </w:p>
     <w:p>
       <w:pPr>
-        <w:pStyle w:val="ListBullet"/>
-        <w:spacing w:after="40"/>
-      </w:pPr>
-      <w:r>
-        <w:t>Data center electrical engineers / project managers (provide designs, specs, settings, commissioning constraints)</w:t>
-      </w:r>
-    </w:p>
-    <w:p>
-      <w:pPr>
-        <w:pStyle w:val="ListBullet"/>
-        <w:spacing w:after="40"/>
-      </w:pPr>
-      <w:r>
-        <w:t>Transmission planners (consume outputs; validate, tune, and use in studies)</w:t>
-      </w:r>
-    </w:p>
-    <w:p>
-      <w:pPr>
-        <w:pStyle w:val="ListBullet"/>
-        <w:spacing w:after="40"/>
-      </w:pPr>
-      <w:r>
-        <w:t>Utilities and ISOs/RTOs (process interconnection; may impose templates and data governance)</w:t>
-      </w:r>
-    </w:p>
-    <w:p>
-      <w:pPr>
-        <w:pStyle w:val="ListBullet"/>
-        <w:spacing w:after="40"/>
-      </w:pPr>
-      <w:proofErr w:type="spellStart"/>
-      <w:r>
-        <w:t>GridSenpAI</w:t>
-      </w:r>
-      <w:proofErr w:type="spellEnd"/>
-      <w:r>
-        <w:t xml:space="preserve"> administrators (manage access, indexing, retention, and audit)</w:t>
-      </w:r>
-    </w:p>
-    <w:p>
-      <w:pPr>
-        <w:pStyle w:val="ListBullet"/>
-        <w:spacing w:after="40"/>
-      </w:pPr>
-      <w:r>
-        <w:t>Security/compliance stakeholders (review handling of sensitive infrastructure documents)</w:t>
+        <w:ind w:left="360" w:hanging="259"/>
+      </w:pPr>
+      <w:r>
+        <w:rPr>
+          <w:b/>
+        </w:rPr>
+        <w:t xml:space="preserve">• </w:t>
+      </w:r>
+      <w:r>
+        <w:t>Data center electrical engineers and project managers who provide designs, specifications, settings, assumptions, and clarifications.</w:t>
+      </w:r>
+    </w:p>
+    <w:p>
+      <w:pPr>
+        <w:ind w:left="360" w:hanging="259"/>
+      </w:pPr>
+      <w:r>
+        <w:rPr>
+          <w:b/>
+        </w:rPr>
+        <w:t xml:space="preserve">• </w:t>
+      </w:r>
+      <w:r>
+        <w:t>Transmission planners who consume outputs, review assumptions, and use the parameter packet in planning studies.</w:t>
+      </w:r>
+    </w:p>
+    <w:p>
+      <w:pPr>
+        <w:ind w:left="360" w:hanging="259"/>
+      </w:pPr>
+      <w:r>
+        <w:rPr>
+          <w:b/>
+        </w:rPr>
+        <w:t xml:space="preserve">• </w:t>
+      </w:r>
+      <w:r>
+        <w:t>Grid electrical engineers and interconnection engineers who review large-load behavior, dynamics, protection, telemetry, and data sufficiency.</w:t>
+      </w:r>
+    </w:p>
+    <w:p>
+      <w:pPr>
+        <w:ind w:left="360" w:hanging="259"/>
+      </w:pPr>
+      <w:r>
+        <w:rPr>
+          <w:b/>
+        </w:rPr>
+        <w:t xml:space="preserve">• </w:t>
+      </w:r>
+      <w:r>
+        <w:t>Utilities and ISOs/RTOs that may impose submission templates, study expectations, governance requirements, or review procedures.</w:t>
+      </w:r>
+    </w:p>
+    <w:p>
+      <w:pPr>
+        <w:ind w:left="360" w:hanging="259"/>
+      </w:pPr>
+      <w:r>
+        <w:rPr>
+          <w:b/>
+        </w:rPr>
+        <w:t xml:space="preserve">• </w:t>
+      </w:r>
+      <w:r>
+        <w:t>GridSenpAI administrators who manage access control, knowledge bases, retention, and auditability.</w:t>
+      </w:r>
+    </w:p>
+    <w:p>
+      <w:pPr>
+        <w:ind w:left="360" w:hanging="259"/>
+      </w:pPr>
+      <w:r>
+        <w:rPr>
+          <w:b/>
+        </w:rPr>
+        <w:t xml:space="preserve">• </w:t>
+      </w:r>
+      <w:r>
+        <w:t>Security and compliance stakeholders who oversee handling of sensitive infrastructure documents and derived engineering data.</w:t>
+      </w:r>
+    </w:p>
+    <w:p>
+      <w:pPr>
+        <w:pStyle w:val="Heading2"/>
+      </w:pPr>
+      <w:r>
+        <w:t>1.4 Operating Principle</w:t>
+      </w:r>
+    </w:p>
+    <w:p>
+      <w:r>
+        <w:t>GridSenpAI is not a general-purpose chatbot. Its interactive behavior is a governed engineering intake assistant that uses structured questions, deterministic validation, canonical-state updates, and bounded LLM assistance when clarification or constrained follow-up is needed.</w:t>
       </w:r>
     </w:p>
     <w:p>
@@ -171,29 +216,148 @@
         <w:pStyle w:val="Heading1"/>
       </w:pPr>
       <w:r>
+        <w:t>2. System Overview</w:t>
+      </w:r>
+    </w:p>
+    <w:p>
+      <w:pPr>
+        <w:pStyle w:val="Heading2"/>
+      </w:pPr>
+      <w:r>
+        <w:t>2.1 System Concept</w:t>
+      </w:r>
+    </w:p>
+    <w:p>
+      <w:r>
+        <w:t>GridSenpAI functions as a translation layer between facility engineering artifacts and grid planning model inputs. It converts topology, equipment detail, operating behavior, interconnection context, and user-confirmed engineering facts into study-usable behavioral parameters that can be entered into transmission planning tools.</w:t>
+      </w:r>
+    </w:p>
+    <w:p>
+      <w:pPr>
+        <w:pStyle w:val="Heading2"/>
+      </w:pPr>
+      <w:r>
         <w:lastRenderedPageBreak/>
-        <w:t>2. System Overview</w:t>
-      </w:r>
-    </w:p>
-    <w:p>
-      <w:pPr>
-        <w:spacing w:after="120"/>
-      </w:pPr>
-      <w:proofErr w:type="spellStart"/>
-      <w:r>
-        <w:t>GridSenpAI</w:t>
-      </w:r>
-      <w:proofErr w:type="spellEnd"/>
-      <w:r>
-        <w:t xml:space="preserve"> functions as a translation layer between facility engineering artifacts and grid planning model inputs. It converts topology and equipment detail into simplified but study-usable behavioral parameters (e.g., ZIP coefficients, dynamic response bounds, ride-through assumptions) that can be directly entered into transmission planning tools.</w:t>
-      </w:r>
-    </w:p>
-    <w:p>
-      <w:pPr>
-        <w:spacing w:after="120"/>
-      </w:pPr>
-      <w:r>
-        <w:t>Primary Watson components in the intended implementation include document ingestion and search (Watson Discovery), retrieval and reasoning for translation (watsonx.ai), and secure enterprise deployment (IBM Cloud services and OpenShift).</w:t>
+        <w:t>2.2 Primary Input Paths</w:t>
+      </w:r>
+    </w:p>
+    <w:p>
+      <w:pPr>
+        <w:ind w:left="360" w:hanging="259"/>
+      </w:pPr>
+      <w:r>
+        <w:rPr>
+          <w:b/>
+        </w:rPr>
+        <w:t xml:space="preserve">• </w:t>
+      </w:r>
+      <w:r>
+        <w:t>Document ingestion path: uploaded facility and interconnection artifacts are parsed, extracted, and normalized.</w:t>
+      </w:r>
+    </w:p>
+    <w:p>
+      <w:pPr>
+        <w:ind w:left="360" w:hanging="259"/>
+      </w:pPr>
+      <w:r>
+        <w:rPr>
+          <w:b/>
+        </w:rPr>
+        <w:t xml:space="preserve">• </w:t>
+      </w:r>
+      <w:r>
+        <w:t>Interactive intake path: a structured applicant interview captures missing, ambiguous, or confirmatory data in a governed workflow.</w:t>
+      </w:r>
+    </w:p>
+    <w:p>
+      <w:pPr>
+        <w:ind w:left="360" w:hanging="259"/>
+      </w:pPr>
+      <w:r>
+        <w:rPr>
+          <w:b/>
+        </w:rPr>
+        <w:t xml:space="preserve">• </w:t>
+      </w:r>
+      <w:r>
+        <w:t>Reference knowledge path: equipment references, vendor specifications, and planning/modeling guidance ground retrieval and support deterministic inference.</w:t>
+      </w:r>
+    </w:p>
+    <w:p>
+      <w:pPr>
+        <w:pStyle w:val="Heading2"/>
+      </w:pPr>
+      <w:r>
+        <w:t>2.3 System Workflow</w:t>
+      </w:r>
+    </w:p>
+    <w:p>
+      <w:pPr>
+        <w:ind w:left="360" w:hanging="259"/>
+      </w:pPr>
+      <w:r>
+        <w:rPr>
+          <w:b/>
+        </w:rPr>
+        <w:t xml:space="preserve">• </w:t>
+      </w:r>
+      <w:r>
+        <w:t>Artifact path -&gt; upload artifacts -&gt; OCR/layout preprocessing when required -&gt; extraction of entities, topology cues, and settings</w:t>
+      </w:r>
+    </w:p>
+    <w:p>
+      <w:pPr>
+        <w:ind w:left="360" w:hanging="259"/>
+      </w:pPr>
+      <w:r>
+        <w:rPr>
+          <w:b/>
+        </w:rPr>
+        <w:t xml:space="preserve">• </w:t>
+      </w:r>
+      <w:r>
+        <w:t>Interview path -&gt; start or resume governed intake session -&gt; present structured questions -&gt; validate responses -&gt; store structured answers</w:t>
+      </w:r>
+    </w:p>
+    <w:p>
+      <w:pPr>
+        <w:ind w:left="360" w:hanging="259"/>
+      </w:pPr>
+      <w:r>
+        <w:rPr>
+          <w:b/>
+        </w:rPr>
+        <w:t xml:space="preserve">• </w:t>
+      </w:r>
+      <w:r>
+        <w:t>Reference path -&gt; retrieve equipment references, standards, and modeling guidance relevant to the project context</w:t>
+      </w:r>
+    </w:p>
+    <w:p>
+      <w:pPr>
+        <w:ind w:left="360" w:hanging="259"/>
+      </w:pPr>
+      <w:r>
+        <w:rPr>
+          <w:b/>
+        </w:rPr>
+        <w:t xml:space="preserve">• </w:t>
+      </w:r>
+      <w:r>
+        <w:t>Combined processing -&gt; ontology classification -&gt; normalization -&gt; canonical facility state -&gt; retrieval-assisted translation -&gt; scenario generation -&gt; export and archival</w:t>
+      </w:r>
+    </w:p>
+    <w:p>
+      <w:pPr>
+        <w:pStyle w:val="Heading2"/>
+      </w:pPr>
+      <w:r>
+        <w:t>2.4 Canonical Facility State</w:t>
+      </w:r>
+    </w:p>
+    <w:p>
+      <w:r>
+        <w:t>The canonical facility state is the authoritative normalized engineering representation used by downstream retrieval, translation, scenario generation, validation, and export. It must unify document-derived facts, user-confirmed answers, retrieved supporting references, field status metadata, provenance metadata, and unresolved conflicts.</w:t>
       </w:r>
     </w:p>
     <w:p>
@@ -206,38 +370,86 @@
     </w:p>
     <w:p>
       <w:pPr>
-        <w:pStyle w:val="ListBullet"/>
-        <w:spacing w:after="40"/>
-      </w:pPr>
-      <w:r>
-        <w:t>Facility documentation may be incomplete early in the interconnection timeline; the system must support partial inputs and generate targeted follow-up questions.</w:t>
-      </w:r>
-    </w:p>
-    <w:p>
-      <w:pPr>
-        <w:pStyle w:val="ListBullet"/>
-        <w:spacing w:after="40"/>
-      </w:pPr>
-      <w:r>
-        <w:t>Some parameters are not directly derivable from datasheets and require assumptions, bounds, or later calibration with commissioning/telemetry data.</w:t>
-      </w:r>
-    </w:p>
-    <w:p>
-      <w:pPr>
-        <w:pStyle w:val="ListBullet"/>
-        <w:spacing w:after="40"/>
-      </w:pPr>
-      <w:r>
-        <w:t>Sensitive infrastructure data must be protected with strong access control, encryption, and auditability.</w:t>
-      </w:r>
-    </w:p>
-    <w:p>
-      <w:pPr>
-        <w:pStyle w:val="ListBullet"/>
-        <w:spacing w:after="40"/>
-      </w:pPr>
-      <w:r>
-        <w:t>Outputs must be traceable: each derived parameter must reference its evidence source(s) and/or the rule used for inference.</w:t>
+        <w:ind w:left="360" w:hanging="259"/>
+      </w:pPr>
+      <w:r>
+        <w:rPr>
+          <w:b/>
+        </w:rPr>
+        <w:t xml:space="preserve">• </w:t>
+      </w:r>
+      <w:r>
+        <w:t>Facility documentation may be incomplete during early interconnection stages; the system must support partial submissions and generate targeted follow-up questions.</w:t>
+      </w:r>
+    </w:p>
+    <w:p>
+      <w:pPr>
+        <w:ind w:left="360" w:hanging="259"/>
+      </w:pPr>
+      <w:r>
+        <w:rPr>
+          <w:b/>
+        </w:rPr>
+        <w:t xml:space="preserve">• </w:t>
+      </w:r>
+      <w:r>
+        <w:t>Some modeling parameters are not directly derivable from datasheets and require bounded assumptions, explicit flags, or later calibration with telemetry or commissioning data.</w:t>
+      </w:r>
+    </w:p>
+    <w:p>
+      <w:pPr>
+        <w:ind w:left="360" w:hanging="259"/>
+      </w:pPr>
+      <w:r>
+        <w:rPr>
+          <w:b/>
+        </w:rPr>
+        <w:t xml:space="preserve">• </w:t>
+      </w:r>
+      <w:r>
+        <w:t>Sensitive infrastructure artifacts and derived parameters require strong access control, encryption, project isolation, and audit logging.</w:t>
+      </w:r>
+    </w:p>
+    <w:p>
+      <w:pPr>
+        <w:ind w:left="360" w:hanging="259"/>
+      </w:pPr>
+      <w:r>
+        <w:rPr>
+          <w:b/>
+        </w:rPr>
+        <w:t xml:space="preserve">• </w:t>
+      </w:r>
+      <w:r>
+        <w:t>Outputs must remain traceable; each derived parameter must reference evidence, a deterministic rule, an explicit assumption, or a documented conflict state.</w:t>
+      </w:r>
+    </w:p>
+    <w:p>
+      <w:pPr>
+        <w:ind w:left="360" w:hanging="259"/>
+      </w:pPr>
+      <w:r>
+        <w:rPr>
+          <w:b/>
+        </w:rPr>
+        <w:t xml:space="preserve">• </w:t>
+      </w:r>
+      <w:r>
+        <w:t>Interactive intake shall rely on structured field capture and canonical-state updates rather than uncontrolled raw chat history as the primary reasoning substrate.</w:t>
+      </w:r>
+    </w:p>
+    <w:p>
+      <w:pPr>
+        <w:ind w:left="360" w:hanging="259"/>
+      </w:pPr>
+      <w:r>
+        <w:rPr>
+          <w:b/>
+        </w:rPr>
+        <w:t xml:space="preserve">• </w:t>
+      </w:r>
+      <w:r>
+        <w:t>When user responses, uploaded artifacts, and retrieved references disagree, the system shall preserve the conflict and request clarification rather than silently selecting an unsupported value.</w:t>
       </w:r>
     </w:p>
     <w:p>
@@ -245,176 +457,740 @@
         <w:pStyle w:val="Heading1"/>
       </w:pPr>
       <w:r>
+        <w:lastRenderedPageBreak/>
         <w:t>4. Functional Requirements</w:t>
       </w:r>
     </w:p>
     <w:p>
       <w:pPr>
-        <w:spacing w:after="120"/>
-      </w:pPr>
-      <w:r>
-        <w:t xml:space="preserve">FR1: The system shall </w:t>
-      </w:r>
-      <w:proofErr w:type="gramStart"/>
-      <w:r>
-        <w:t>ingest</w:t>
-      </w:r>
-      <w:proofErr w:type="gramEnd"/>
-      <w:r>
-        <w:t xml:space="preserve"> facility electrical design artifacts (one-line diagrams, equipment schedules, protection summaries, commissioning plans). Document </w:t>
-      </w:r>
-      <w:proofErr w:type="gramStart"/>
-      <w:r>
-        <w:t>ingestion</w:t>
-      </w:r>
-      <w:proofErr w:type="gramEnd"/>
-      <w:r>
-        <w:t xml:space="preserve"> (IBM Watson Discovery).</w:t>
-      </w:r>
-    </w:p>
-    <w:p>
-      <w:pPr>
-        <w:spacing w:after="120"/>
-      </w:pPr>
-      <w:r>
-        <w:t>FR2: The system shall parse ingested documents and extract structured entities (equipment types, ratings, topology cues, settings). Document parsing (IBM Watson Discovery enrichments + watsonx.ai).</w:t>
-      </w:r>
-    </w:p>
-    <w:p>
-      <w:pPr>
-        <w:spacing w:after="120"/>
-      </w:pPr>
-      <w:r>
-        <w:t>FR3: The system shall retrieve vendor specification details and modeling references using retrieval-augmented generation. RAG (IBM Watson Discovery + watsonx.ai).</w:t>
-      </w:r>
-    </w:p>
-    <w:p>
-      <w:pPr>
-        <w:spacing w:after="120"/>
-      </w:pPr>
-      <w:r>
-        <w:t xml:space="preserve">FR4: The system shall normalize extracted inputs into a structured internal schema aligned to </w:t>
-      </w:r>
-      <w:proofErr w:type="spellStart"/>
-      <w:r>
-        <w:t>GridSenpAI</w:t>
-      </w:r>
-      <w:r>
-        <w:t>_inputs_</w:t>
-      </w:r>
-      <w:proofErr w:type="gramStart"/>
-      <w:r>
-        <w:t>schema.json</w:t>
-      </w:r>
-      <w:proofErr w:type="spellEnd"/>
-      <w:proofErr w:type="gramEnd"/>
-      <w:r>
-        <w:t xml:space="preserve"> (Relational database (IBM Db2 / PostgreSQL)).</w:t>
-      </w:r>
-    </w:p>
-    <w:p>
-      <w:pPr>
-        <w:spacing w:after="120"/>
-      </w:pPr>
-      <w:r>
-        <w:t xml:space="preserve">FR5: The system shall generate TP-ready modeling outputs aligned to </w:t>
-      </w:r>
-      <w:proofErr w:type="spellStart"/>
-      <w:r>
-        <w:t>GridSenpAI</w:t>
-      </w:r>
-      <w:r>
-        <w:t>_outputs_</w:t>
-      </w:r>
-      <w:proofErr w:type="gramStart"/>
-      <w:r>
-        <w:t>schema.json</w:t>
-      </w:r>
-      <w:proofErr w:type="spellEnd"/>
-      <w:proofErr w:type="gramEnd"/>
-      <w:r>
-        <w:t>, including steady-state, ZIP, dynamic parameters, composition, ramping, and flags.</w:t>
-      </w:r>
-    </w:p>
-    <w:p>
-      <w:pPr>
-        <w:spacing w:after="120"/>
-      </w:pPr>
-      <w:r>
-        <w:t xml:space="preserve">FR6: The system </w:t>
-      </w:r>
-      <w:proofErr w:type="gramStart"/>
-      <w:r>
-        <w:t>shall</w:t>
-      </w:r>
-      <w:proofErr w:type="gramEnd"/>
-      <w:r>
-        <w:t xml:space="preserve"> output a modeling packet that </w:t>
-      </w:r>
-      <w:proofErr w:type="gramStart"/>
-      <w:r>
-        <w:t>includes:</w:t>
-      </w:r>
-      <w:proofErr w:type="gramEnd"/>
-      <w:r>
-        <w:t xml:space="preserve"> parameters, assumptions, confidence tags, and citations to evidence sources (traceability).</w:t>
-      </w:r>
-    </w:p>
-    <w:p>
-      <w:pPr>
-        <w:spacing w:after="120"/>
-      </w:pPr>
-      <w:r>
-        <w:t>FR7: The system shall generate multiple modeling scenarios (Typical, Conservative, Best-case) with explicit parameter bounds and rationale.</w:t>
-      </w:r>
-    </w:p>
-    <w:p>
-      <w:pPr>
-        <w:spacing w:after="120"/>
+        <w:pStyle w:val="Heading2"/>
+      </w:pPr>
+      <w:r>
+        <w:t>4.1 Artifact Ingestion and Preprocessing</w:t>
+      </w:r>
+    </w:p>
+    <w:p>
+      <w:pPr>
+        <w:ind w:left="216" w:hanging="216"/>
+      </w:pPr>
+      <w:r>
+        <w:rPr>
+          <w:rStyle w:val="ReqID"/>
+        </w:rPr>
+        <w:t xml:space="preserve">FR-ING-01 </w:t>
+      </w:r>
+      <w:r>
+        <w:t>The system shall ingest facility electrical design artifacts including one-line diagrams, equipment schedules, protection summaries, commissioning plans, UPS documentation, generator specifications, cooling-system documentation, and other major equipment references.</w:t>
+      </w:r>
+    </w:p>
+    <w:p>
+      <w:pPr>
+        <w:ind w:left="216" w:hanging="216"/>
+      </w:pPr>
+      <w:r>
+        <w:rPr>
+          <w:rStyle w:val="ReqID"/>
+        </w:rPr>
+        <w:t xml:space="preserve">FR-ING-02 </w:t>
+      </w:r>
+      <w:r>
+        <w:t>The system shall ingest interconnection-related artifacts including point-of-interconnection documentation, substation topology material, protection diagrams, telemetry and metering requirements, and other planner-facing submission artifacts where available.</w:t>
+      </w:r>
+    </w:p>
+    <w:p>
+      <w:pPr>
+        <w:ind w:left="216" w:hanging="216"/>
+      </w:pPr>
+      <w:r>
+        <w:rPr>
+          <w:rStyle w:val="ReqID"/>
+        </w:rPr>
+        <w:t xml:space="preserve">FR-ING-03 </w:t>
+      </w:r>
+      <w:r>
+        <w:t>The system shall support ingestion of both born-digital and scanned engineering documents.</w:t>
+      </w:r>
+    </w:p>
+    <w:p>
+      <w:pPr>
+        <w:ind w:left="216" w:hanging="216"/>
+      </w:pPr>
+      <w:r>
+        <w:rPr>
+          <w:rStyle w:val="ReqID"/>
+        </w:rPr>
+        <w:t xml:space="preserve">FR-ING-04 </w:t>
+      </w:r>
+      <w:r>
+        <w:t>For scanned or image-heavy documents, the system shall perform OCR and layout-aware preprocessing before extraction.</w:t>
+      </w:r>
+    </w:p>
+    <w:p>
+      <w:pPr>
+        <w:ind w:left="216" w:hanging="216"/>
+      </w:pPr>
+      <w:r>
+        <w:rPr>
+          <w:rStyle w:val="ReqID"/>
+        </w:rPr>
+        <w:t xml:space="preserve">FR-ING-05 </w:t>
+      </w:r>
+      <w:r>
+        <w:t>The system shall preserve uploaded artifacts, extracted text, page-level anchors, and run linkage required for traceability and reproducibility.</w:t>
+      </w:r>
+    </w:p>
+    <w:p>
+      <w:pPr>
+        <w:pStyle w:val="Heading2"/>
+      </w:pPr>
+      <w:r>
+        <w:t>4.2 Extraction and Ontology Classification</w:t>
+      </w:r>
+    </w:p>
+    <w:p>
+      <w:pPr>
+        <w:ind w:left="216" w:hanging="216"/>
+      </w:pPr>
+      <w:r>
+        <w:rPr>
+          <w:rStyle w:val="ReqID"/>
+        </w:rPr>
+        <w:t xml:space="preserve">FR-EXT-01 </w:t>
+      </w:r>
+      <w:r>
+        <w:t>The system shall parse ingested documents and extract structured engineering entities including equipment types, ratings, topology cues, settings, and configuration metadata.</w:t>
+      </w:r>
+    </w:p>
+    <w:p>
+      <w:pPr>
+        <w:ind w:left="216" w:hanging="216"/>
+      </w:pPr>
+      <w:r>
+        <w:rPr>
+          <w:rStyle w:val="ReqID"/>
+        </w:rPr>
+        <w:t xml:space="preserve">FR-EXT-02 </w:t>
+      </w:r>
+      <w:r>
+        <w:t>The system shall extract interconnection-relevant entities where present, including POI references, substation topology cues, protection information, metering context, and telemetry or SCADA-related requirements.</w:t>
+      </w:r>
+    </w:p>
+    <w:p>
+      <w:pPr>
+        <w:ind w:left="216" w:hanging="216"/>
+      </w:pPr>
+      <w:r>
+        <w:rPr>
+          <w:rStyle w:val="ReqID"/>
+        </w:rPr>
+        <w:t xml:space="preserve">FR-EXT-03 </w:t>
+      </w:r>
+      <w:r>
+        <w:t>The system shall normalize extracted units, labels, and values into schema-compatible forms.</w:t>
+      </w:r>
+    </w:p>
+    <w:p>
+      <w:pPr>
+        <w:ind w:left="216" w:hanging="216"/>
+      </w:pPr>
+      <w:r>
+        <w:rPr>
+          <w:rStyle w:val="ReqID"/>
+        </w:rPr>
+        <w:t xml:space="preserve">FR-EXT-04 </w:t>
+      </w:r>
+      <w:r>
+        <w:t>The system shall classify extracted concepts against the GridSenpAI domain ontology so that equivalent concepts from different source vocabularies map to canonical meanings.</w:t>
+      </w:r>
+    </w:p>
+    <w:p>
+      <w:pPr>
+        <w:ind w:left="216" w:hanging="216"/>
+      </w:pPr>
+      <w:r>
+        <w:rPr>
+          <w:rStyle w:val="ReqID"/>
+        </w:rPr>
+        <w:t xml:space="preserve">FR-EXT-05 </w:t>
+      </w:r>
+      <w:r>
+        <w:t>The system shall retain source anchors and evidence references for extracted values so downstream outputs can cite their origin.</w:t>
+      </w:r>
+    </w:p>
+    <w:p>
+      <w:pPr>
+        <w:pStyle w:val="Heading2"/>
+      </w:pPr>
+      <w:r>
+        <w:t>4.3 Retrieval and Knowledge Support</w:t>
+      </w:r>
+    </w:p>
+    <w:p>
+      <w:pPr>
+        <w:ind w:left="216" w:hanging="216"/>
+      </w:pPr>
+      <w:r>
+        <w:rPr>
+          <w:rStyle w:val="ReqID"/>
+        </w:rPr>
+        <w:t xml:space="preserve">FR-RAG-01 </w:t>
+      </w:r>
+      <w:r>
+        <w:t>The system shall retrieve vendor specification details, equipment behavior references, interconnection guidance, and modeling references using a grounded retrieval workflow.</w:t>
+      </w:r>
+    </w:p>
+    <w:p>
+      <w:pPr>
+        <w:ind w:left="216" w:hanging="216"/>
+      </w:pPr>
+      <w:r>
+        <w:rPr>
+          <w:rStyle w:val="ReqID"/>
+        </w:rPr>
+        <w:t xml:space="preserve">FR-RAG-02 </w:t>
+      </w:r>
+      <w:r>
+        <w:t>The retrievable corpus shall include, where available, UPS systems, backup generators, transformers, switchgear, relays, cooling systems, mechanical plant equipment, VFDs, and other major load-driving equipment.</w:t>
+      </w:r>
+    </w:p>
+    <w:p>
+      <w:pPr>
+        <w:ind w:left="216" w:hanging="216"/>
+      </w:pPr>
+      <w:r>
+        <w:rPr>
+          <w:rStyle w:val="ReqID"/>
+        </w:rPr>
+        <w:t xml:space="preserve">FR-RAG-03 </w:t>
+      </w:r>
+      <w:r>
+        <w:t>The system shall support distinct knowledge families for equipment references, interconnection/planning guidance, and modeling references so retrieval results can be interpreted according to source type.</w:t>
+      </w:r>
+    </w:p>
+    <w:p>
+      <w:pPr>
+        <w:ind w:left="216" w:hanging="216"/>
+      </w:pPr>
+      <w:r>
+        <w:rPr>
+          <w:rStyle w:val="ReqID"/>
+        </w:rPr>
+        <w:t xml:space="preserve">FR-RAG-04 </w:t>
+      </w:r>
+      <w:r>
+        <w:t>The system shall maintain terminology and concept-mapping content that supports translation between facility-side language and grid-side modeling language.</w:t>
+      </w:r>
+    </w:p>
+    <w:p>
+      <w:pPr>
+        <w:ind w:left="216" w:hanging="216"/>
+      </w:pPr>
+      <w:r>
+        <w:rPr>
+          <w:rStyle w:val="ReqID"/>
+        </w:rPr>
+        <w:t xml:space="preserve">FR-RAG-05 </w:t>
+      </w:r>
+      <w:r>
+        <w:t>If required supporting evidence cannot be retrieved, the system shall flag the gap and request additional information rather than fabricating an unsupported value.</w:t>
+      </w:r>
+    </w:p>
+    <w:p>
+      <w:pPr>
+        <w:pStyle w:val="Heading2"/>
       </w:pPr>
       <w:r>
         <w:lastRenderedPageBreak/>
-        <w:t>FR8: The system shall identify missing or ambiguous information and generate a precise follow-up question list suitable for the facility engineer.</w:t>
-      </w:r>
-    </w:p>
-    <w:p>
-      <w:pPr>
-        <w:spacing w:after="120"/>
-      </w:pPr>
-      <w:r>
-        <w:t xml:space="preserve">FR9: The system </w:t>
-      </w:r>
-      <w:proofErr w:type="gramStart"/>
-      <w:r>
-        <w:t>shall</w:t>
-      </w:r>
-      <w:proofErr w:type="gramEnd"/>
-      <w:r>
-        <w:t xml:space="preserve"> support export formats including structured JSON outputs and a human-readable Word/PDF packet; optional tool templates may be generated (e.g., parameter sheets).</w:t>
-      </w:r>
-    </w:p>
-    <w:p>
-      <w:pPr>
-        <w:spacing w:after="120"/>
-      </w:pPr>
-      <w:r>
-        <w:t>FR10: The system shall support re-run/</w:t>
-      </w:r>
-      <w:proofErr w:type="gramStart"/>
-      <w:r>
-        <w:t>versioning:</w:t>
-      </w:r>
-      <w:proofErr w:type="gramEnd"/>
-      <w:r>
-        <w:t xml:space="preserve"> given updated inputs, outputs are regenerated with a version label and a changelog of parameter differences.</w:t>
-      </w:r>
-    </w:p>
-    <w:p>
-      <w:pPr>
-        <w:spacing w:after="120"/>
-      </w:pPr>
-      <w:r>
-        <w:t>FR11: The system shall support an optional validation workflow where commissioning/telemetry observations can update model parameters and reduce uncertainty over time.</w:t>
+        <w:t>4.4 Structured Interview Intake</w:t>
+      </w:r>
+    </w:p>
+    <w:p>
+      <w:pPr>
+        <w:ind w:left="216" w:hanging="216"/>
+      </w:pPr>
+      <w:r>
+        <w:rPr>
+          <w:rStyle w:val="ReqID"/>
+        </w:rPr>
+        <w:t xml:space="preserve">FR-INT-01 </w:t>
+      </w:r>
+      <w:r>
+        <w:t>The system shall support a structured intake session that starts or resumes a project interview and tracks answered, inferred, conflicting, and still-missing fields.</w:t>
+      </w:r>
+    </w:p>
+    <w:p>
+      <w:pPr>
+        <w:ind w:left="216" w:hanging="216"/>
+      </w:pPr>
+      <w:r>
+        <w:rPr>
+          <w:rStyle w:val="ReqID"/>
+        </w:rPr>
+        <w:t xml:space="preserve">FR-INT-02 </w:t>
+      </w:r>
+      <w:r>
+        <w:t>The system shall present defined facility-design and interconnection-relevant questions when required data cannot be extracted with sufficient confidence from artifacts.</w:t>
+      </w:r>
+    </w:p>
+    <w:p>
+      <w:pPr>
+        <w:ind w:left="216" w:hanging="216"/>
+      </w:pPr>
+      <w:r>
+        <w:rPr>
+          <w:rStyle w:val="ReqID"/>
+        </w:rPr>
+        <w:t xml:space="preserve">FR-INT-03 </w:t>
+      </w:r>
+      <w:r>
+        <w:t>Interview questions shall map to fields, field groups, or validation states within the canonical input schema.</w:t>
+      </w:r>
+    </w:p>
+    <w:p>
+      <w:pPr>
+        <w:ind w:left="216" w:hanging="216"/>
+      </w:pPr>
+      <w:r>
+        <w:rPr>
+          <w:rStyle w:val="ReqID"/>
+        </w:rPr>
+        <w:t xml:space="preserve">FR-INT-04 </w:t>
+      </w:r>
+      <w:r>
+        <w:t>The system shall validate interview responses against schema rules, expected value types, ranges, units, and dependency constraints.</w:t>
+      </w:r>
+    </w:p>
+    <w:p>
+      <w:pPr>
+        <w:ind w:left="216" w:hanging="216"/>
+      </w:pPr>
+      <w:r>
+        <w:rPr>
+          <w:rStyle w:val="ReqID"/>
+        </w:rPr>
+        <w:t xml:space="preserve">FR-INT-05 </w:t>
+      </w:r>
+      <w:r>
+        <w:t>When a response is non-conforming, ambiguous, incomplete, or contradictory, the system shall generate targeted clarification or follow-up prompts.</w:t>
+      </w:r>
+    </w:p>
+    <w:p>
+      <w:pPr>
+        <w:ind w:left="216" w:hanging="216"/>
+      </w:pPr>
+      <w:r>
+        <w:rPr>
+          <w:rStyle w:val="ReqID"/>
+        </w:rPr>
+        <w:t xml:space="preserve">FR-INT-06 </w:t>
+      </w:r>
+      <w:r>
+        <w:t>The system shall avoid repeatedly asking for information that is already confirmed by canonical-state data unless a conflict or change requires reconfirmation.</w:t>
+      </w:r>
+    </w:p>
+    <w:p>
+      <w:pPr>
+        <w:ind w:left="216" w:hanging="216"/>
+      </w:pPr>
+      <w:r>
+        <w:rPr>
+          <w:rStyle w:val="ReqID"/>
+        </w:rPr>
+        <w:t xml:space="preserve">FR-INT-07 </w:t>
+      </w:r>
+      <w:r>
+        <w:t>The system shall store interview responses as structured project data with field-level provenance, timestamps, and run linkage.</w:t>
+      </w:r>
+    </w:p>
+    <w:p>
+      <w:pPr>
+        <w:ind w:left="216" w:hanging="216"/>
+      </w:pPr>
+      <w:r>
+        <w:rPr>
+          <w:rStyle w:val="ReqID"/>
+        </w:rPr>
+        <w:t xml:space="preserve">FR-INT-08 </w:t>
+      </w:r>
+      <w:r>
+        <w:t>The system shall merge user interview responses with extracted and retrieved facts into one canonical facility state rather than maintaining a separate modeling source of truth.</w:t>
+      </w:r>
+    </w:p>
+    <w:p>
+      <w:pPr>
+        <w:pStyle w:val="Heading2"/>
+      </w:pPr>
+      <w:r>
+        <w:t>4.5 Bounded LLM Co-Pilot Behavior</w:t>
+      </w:r>
+    </w:p>
+    <w:p>
+      <w:pPr>
+        <w:ind w:left="216" w:hanging="216"/>
+      </w:pPr>
+      <w:r>
+        <w:rPr>
+          <w:rStyle w:val="ReqID"/>
+        </w:rPr>
+        <w:t xml:space="preserve">FR-AI-01 </w:t>
+      </w:r>
+      <w:r>
+        <w:t>The system shall permit LLM assistance for OCR interpretation of ambiguous scanned content, explanation of intake questions, constrained follow-up generation, and interpretation of non-conforming user answers.</w:t>
+      </w:r>
+    </w:p>
+    <w:p>
+      <w:pPr>
+        <w:ind w:left="216" w:hanging="216"/>
+      </w:pPr>
+      <w:r>
+        <w:rPr>
+          <w:rStyle w:val="ReqID"/>
+        </w:rPr>
+        <w:t xml:space="preserve">FR-AI-02 </w:t>
+      </w:r>
+      <w:r>
+        <w:t>The system shall restrict LLM assistance from becoming the authoritative source of engineering fact unless the result is validated and persisted as structured canonical data.</w:t>
+      </w:r>
+    </w:p>
+    <w:p>
+      <w:pPr>
+        <w:ind w:left="216" w:hanging="216"/>
+      </w:pPr>
+      <w:r>
+        <w:rPr>
+          <w:rStyle w:val="ReqID"/>
+        </w:rPr>
+        <w:t xml:space="preserve">FR-AI-03 </w:t>
+      </w:r>
+      <w:r>
+        <w:t>The system shall require parameter generation to cite evidence passages, deterministic rules, or explicit assumptions rather than relying on uncited generative output.</w:t>
+      </w:r>
+    </w:p>
+    <w:p>
+      <w:pPr>
+        <w:ind w:left="216" w:hanging="216"/>
+      </w:pPr>
+      <w:r>
+        <w:rPr>
+          <w:rStyle w:val="ReqID"/>
+        </w:rPr>
+        <w:t xml:space="preserve">FR-AI-04 </w:t>
+      </w:r>
+      <w:r>
+        <w:t>When evidence is insufficient, the system shall produce a missing-data request, unresolved gap, or review-required conflict instead of inventing a value.</w:t>
+      </w:r>
+    </w:p>
+    <w:p>
+      <w:pPr>
+        <w:ind w:left="216" w:hanging="216"/>
+      </w:pPr>
+      <w:r>
+        <w:rPr>
+          <w:rStyle w:val="ReqID"/>
+        </w:rPr>
+        <w:t xml:space="preserve">FR-AI-05 </w:t>
+      </w:r>
+      <w:r>
+        <w:t>The system shall record prompt-governance and run-governance metadata sufficient to audit how LLM-assisted outputs were produced.</w:t>
+      </w:r>
+    </w:p>
+    <w:p>
+      <w:pPr>
+        <w:pStyle w:val="Heading2"/>
+      </w:pPr>
+      <w:r>
+        <w:t>4.6 Normalization and Canonical State Management</w:t>
+      </w:r>
+    </w:p>
+    <w:p>
+      <w:pPr>
+        <w:ind w:left="216" w:hanging="216"/>
+      </w:pPr>
+      <w:r>
+        <w:rPr>
+          <w:rStyle w:val="ReqID"/>
+        </w:rPr>
+        <w:t xml:space="preserve">FR-NRM-01 </w:t>
+      </w:r>
+      <w:r>
+        <w:t>The system shall normalize extracted inputs and structured interview responses into a unified internal schema aligned to GridSenpAI_inputs_schema.json.</w:t>
+      </w:r>
+    </w:p>
+    <w:p>
+      <w:pPr>
+        <w:ind w:left="216" w:hanging="216"/>
+      </w:pPr>
+      <w:r>
+        <w:rPr>
+          <w:rStyle w:val="ReqID"/>
+        </w:rPr>
+        <w:t xml:space="preserve">FR-NRM-02 </w:t>
+      </w:r>
+      <w:r>
+        <w:t>The system shall maintain a single canonical facility state that supports document-derived values, interview-confirmed values, inferred values, assumed values, conflicting values, and missing values.</w:t>
+      </w:r>
+    </w:p>
+    <w:p>
+      <w:pPr>
+        <w:ind w:left="216" w:hanging="216"/>
+      </w:pPr>
+      <w:r>
+        <w:rPr>
+          <w:rStyle w:val="ReqID"/>
+        </w:rPr>
+        <w:t xml:space="preserve">FR-NRM-03 </w:t>
+      </w:r>
+      <w:r>
+        <w:t>The system shall preserve field-level provenance and confidence metadata for canonical-state values.</w:t>
+      </w:r>
+    </w:p>
+    <w:p>
+      <w:pPr>
+        <w:ind w:left="216" w:hanging="216"/>
+      </w:pPr>
+      <w:r>
+        <w:rPr>
+          <w:rStyle w:val="ReqID"/>
+        </w:rPr>
+        <w:t xml:space="preserve">FR-NRM-04 </w:t>
+      </w:r>
+      <w:r>
+        <w:t>When multiple sources disagree, the system shall preserve the conflict, lower confidence as appropriate, and mark the field for clarification or review.</w:t>
+      </w:r>
+    </w:p>
+    <w:p>
+      <w:pPr>
+        <w:ind w:left="216" w:hanging="216"/>
+      </w:pPr>
+      <w:r>
+        <w:rPr>
+          <w:rStyle w:val="ReqID"/>
+        </w:rPr>
+        <w:lastRenderedPageBreak/>
+        <w:t xml:space="preserve">FR-NRM-05 </w:t>
+      </w:r>
+      <w:r>
+        <w:t>The system shall persist canonical-state snapshots or equivalent lineage records needed to reproduce a modeling run.</w:t>
+      </w:r>
+    </w:p>
+    <w:p>
+      <w:pPr>
+        <w:pStyle w:val="Heading2"/>
+      </w:pPr>
+      <w:r>
+        <w:t>4.7 Translation and Output Generation</w:t>
+      </w:r>
+    </w:p>
+    <w:p>
+      <w:pPr>
+        <w:ind w:left="216" w:hanging="216"/>
+      </w:pPr>
+      <w:r>
+        <w:rPr>
+          <w:rStyle w:val="ReqID"/>
+        </w:rPr>
+        <w:t xml:space="preserve">FR-TRN-01 </w:t>
+      </w:r>
+      <w:r>
+        <w:t>The system shall generate planner-ready outputs aligned to GridSenpAI_outputs_schema.json.</w:t>
+      </w:r>
+    </w:p>
+    <w:p>
+      <w:pPr>
+        <w:ind w:left="216" w:hanging="216"/>
+      </w:pPr>
+      <w:r>
+        <w:rPr>
+          <w:rStyle w:val="ReqID"/>
+        </w:rPr>
+        <w:t xml:space="preserve">FR-TRN-02 </w:t>
+      </w:r>
+      <w:r>
+        <w:t>The system shall produce modeling parameters covering, at minimum where applicable, steady-state behavior, ZIP load characteristics, dynamic parameters, load composition, ramping characteristics, and review flags.</w:t>
+      </w:r>
+    </w:p>
+    <w:p>
+      <w:pPr>
+        <w:ind w:left="216" w:hanging="216"/>
+      </w:pPr>
+      <w:r>
+        <w:rPr>
+          <w:rStyle w:val="ReqID"/>
+        </w:rPr>
+        <w:t xml:space="preserve">FR-TRN-03 </w:t>
+      </w:r>
+      <w:r>
+        <w:t>The system shall translate terminology and context so semantically equivalent facility-side and grid-side concepts are explained and exported consistently.</w:t>
+      </w:r>
+    </w:p>
+    <w:p>
+      <w:pPr>
+        <w:ind w:left="216" w:hanging="216"/>
+      </w:pPr>
+      <w:r>
+        <w:rPr>
+          <w:rStyle w:val="ReqID"/>
+        </w:rPr>
+        <w:t xml:space="preserve">FR-TRN-04 </w:t>
+      </w:r>
+      <w:r>
+        <w:t>The system shall produce a modeling-ready technical intake package that distinguishes confirmed values, evidence-backed inferred values, assumptions, unresolved gaps, and review-required conflicts.</w:t>
+      </w:r>
+    </w:p>
+    <w:p>
+      <w:pPr>
+        <w:ind w:left="216" w:hanging="216"/>
+      </w:pPr>
+      <w:r>
+        <w:rPr>
+          <w:rStyle w:val="ReqID"/>
+        </w:rPr>
+        <w:t xml:space="preserve">FR-TRN-05 </w:t>
+      </w:r>
+      <w:r>
+        <w:t>The system shall attach confidence tags and rationale to derived outputs.</w:t>
+      </w:r>
+    </w:p>
+    <w:p>
+      <w:pPr>
+        <w:ind w:left="216" w:hanging="216"/>
+      </w:pPr>
+      <w:r>
+        <w:rPr>
+          <w:rStyle w:val="ReqID"/>
+        </w:rPr>
+        <w:t xml:space="preserve">FR-TRN-06 </w:t>
+      </w:r>
+      <w:r>
+        <w:t>The system shall support generation of missing-information lists and targeted follow-up questions when modeling-critical fields remain unresolved.</w:t>
+      </w:r>
+    </w:p>
+    <w:p>
+      <w:pPr>
+        <w:pStyle w:val="Heading2"/>
+      </w:pPr>
+      <w:r>
+        <w:t>4.8 Scenario Generation, Export, and Versioning</w:t>
+      </w:r>
+    </w:p>
+    <w:p>
+      <w:pPr>
+        <w:ind w:left="216" w:hanging="216"/>
+      </w:pPr>
+      <w:r>
+        <w:rPr>
+          <w:rStyle w:val="ReqID"/>
+        </w:rPr>
+        <w:t xml:space="preserve">FR-SCN-01 </w:t>
+      </w:r>
+      <w:r>
+        <w:t>The system shall generate multiple modeling scenarios such as Typical, Conservative, and Best-case, with explicit bounds and rationale.</w:t>
+      </w:r>
+    </w:p>
+    <w:p>
+      <w:pPr>
+        <w:ind w:left="216" w:hanging="216"/>
+      </w:pPr>
+      <w:r>
+        <w:rPr>
+          <w:rStyle w:val="ReqID"/>
+        </w:rPr>
+        <w:t xml:space="preserve">FR-SCN-02 </w:t>
+      </w:r>
+      <w:r>
+        <w:t>The system shall support scenario variation based on build-out phase, equipment redundancy state, cooling demand condition, operating assumption, and ramping behavior where relevant.</w:t>
+      </w:r>
+    </w:p>
+    <w:p>
+      <w:pPr>
+        <w:ind w:left="216" w:hanging="216"/>
+      </w:pPr>
+      <w:r>
+        <w:rPr>
+          <w:rStyle w:val="ReqID"/>
+        </w:rPr>
+        <w:t xml:space="preserve">FR-EXP-01 </w:t>
+      </w:r>
+      <w:r>
+        <w:t>The system shall support export formats including structured JSON outputs and a human-readable Word or PDF packet.</w:t>
+      </w:r>
+    </w:p>
+    <w:p>
+      <w:pPr>
+        <w:ind w:left="216" w:hanging="216"/>
+      </w:pPr>
+      <w:r>
+        <w:rPr>
+          <w:rStyle w:val="ReqID"/>
+        </w:rPr>
+        <w:t xml:space="preserve">FR-EXP-02 </w:t>
+      </w:r>
+      <w:r>
+        <w:t>The exported modeling packet shall include parameters, assumptions, confidence tags, provenance references, unresolved gaps, and review-required conflicts.</w:t>
+      </w:r>
+    </w:p>
+    <w:p>
+      <w:pPr>
+        <w:ind w:left="216" w:hanging="216"/>
+      </w:pPr>
+      <w:r>
+        <w:rPr>
+          <w:rStyle w:val="ReqID"/>
+        </w:rPr>
+        <w:t xml:space="preserve">FR-VER-01 </w:t>
+      </w:r>
+      <w:r>
+        <w:t>The system shall support rerun and versioning so that updated inputs generate a new version label and a changelog of parameter differences.</w:t>
+      </w:r>
+    </w:p>
+    <w:p>
+      <w:pPr>
+        <w:pStyle w:val="Heading2"/>
+      </w:pPr>
+      <w:r>
+        <w:t>4.9 Validation and Calibration Workflow</w:t>
+      </w:r>
+    </w:p>
+    <w:p>
+      <w:pPr>
+        <w:ind w:left="216" w:hanging="216"/>
+      </w:pPr>
+      <w:r>
+        <w:rPr>
+          <w:rStyle w:val="ReqID"/>
+        </w:rPr>
+        <w:t xml:space="preserve">FR-VAL-01 </w:t>
+      </w:r>
+      <w:r>
+        <w:t>The system shall support an optional validation workflow in which commissioning results, telemetry, or later engineering evidence can update model parameters and reduce uncertainty.</w:t>
+      </w:r>
+    </w:p>
+    <w:p>
+      <w:pPr>
+        <w:ind w:left="216" w:hanging="216"/>
+      </w:pPr>
+      <w:r>
+        <w:rPr>
+          <w:rStyle w:val="ReqID"/>
+        </w:rPr>
+        <w:t xml:space="preserve">FR-VAL-02 </w:t>
+      </w:r>
+      <w:r>
+        <w:t>The validation workflow shall preserve version history, auditability, prior assumptions, and superseded values.</w:t>
+      </w:r>
+    </w:p>
+    <w:p>
+      <w:pPr>
+        <w:ind w:left="216" w:hanging="216"/>
+      </w:pPr>
+      <w:r>
+        <w:rPr>
+          <w:rStyle w:val="ReqID"/>
+        </w:rPr>
+        <w:t xml:space="preserve">FR-VAL-03 </w:t>
+      </w:r>
+      <w:r>
+        <w:t>The system shall permit planner or engineering review of unresolved assumptions and conflicts before final export.</w:t>
       </w:r>
     </w:p>
     <w:p>
@@ -427,106 +1203,185 @@
     </w:p>
     <w:p>
       <w:pPr>
-        <w:spacing w:after="120"/>
-      </w:pPr>
-      <w:r>
-        <w:t xml:space="preserve">NFR1 Security: The system shall enforce </w:t>
-      </w:r>
-      <w:proofErr w:type="gramStart"/>
-      <w:r>
-        <w:t>least-privilege</w:t>
-      </w:r>
-      <w:proofErr w:type="gramEnd"/>
-      <w:r>
-        <w:t xml:space="preserve"> access to facility documents and derived parameters (Identity and access management (IBM Cloud IAM)).</w:t>
-      </w:r>
-    </w:p>
-    <w:p>
-      <w:pPr>
-        <w:spacing w:after="120"/>
-      </w:pPr>
-      <w:r>
-        <w:t xml:space="preserve">NFR2 Encryption: The system shall encrypt documents at rest and in transit (Key management (IBM Key Protect); Object storage (IBM Cloud Object </w:t>
-      </w:r>
-      <w:proofErr w:type="gramStart"/>
-      <w:r>
-        <w:t>Storage))</w:t>
-      </w:r>
-      <w:proofErr w:type="gramEnd"/>
-      <w:r>
-        <w:t>.</w:t>
-      </w:r>
-    </w:p>
-    <w:p>
-      <w:pPr>
-        <w:spacing w:after="120"/>
-      </w:pPr>
-      <w:r>
-        <w:t xml:space="preserve">NFR3 Auditability: The system shall </w:t>
-      </w:r>
-      <w:proofErr w:type="gramStart"/>
-      <w:r>
-        <w:t>log</w:t>
-      </w:r>
-      <w:proofErr w:type="gramEnd"/>
-      <w:r>
-        <w:t xml:space="preserve"> access and model generation events for audit (Observability / monitoring (IBM </w:t>
-      </w:r>
-      <w:proofErr w:type="spellStart"/>
-      <w:r>
-        <w:t>Instana</w:t>
-      </w:r>
-      <w:proofErr w:type="spellEnd"/>
-      <w:r>
-        <w:t xml:space="preserve"> / IBM Log </w:t>
-      </w:r>
-      <w:proofErr w:type="gramStart"/>
-      <w:r>
-        <w:t>Analysis))</w:t>
-      </w:r>
-      <w:proofErr w:type="gramEnd"/>
-      <w:r>
-        <w:t>.</w:t>
-      </w:r>
-    </w:p>
-    <w:p>
-      <w:pPr>
-        <w:spacing w:after="120"/>
-      </w:pPr>
-      <w:r>
-        <w:t>NFR4 Traceability: Each output parameter shall include provenance: source document, retrieval snippet ID, or rule/inference reference.</w:t>
-      </w:r>
-    </w:p>
-    <w:p>
-      <w:pPr>
-        <w:spacing w:after="120"/>
-      </w:pPr>
-      <w:r>
-        <w:t>NFR5 Reproducibility: Given the same inputs and pinned model/version, outputs shall be reproducible within documented tolerance.</w:t>
-      </w:r>
-    </w:p>
-    <w:p>
-      <w:pPr>
-        <w:spacing w:after="120"/>
-      </w:pPr>
-      <w:r>
-        <w:t>NFR6 Performance: For a typical submission set (&lt;500 pages of specs), produce an initial modeling packet within an operationally acceptable timeframe for engineering workflow.</w:t>
-      </w:r>
-    </w:p>
-    <w:p>
-      <w:pPr>
-        <w:spacing w:after="120"/>
-      </w:pPr>
-      <w:r>
-        <w:t>NFR7 Availability: System shall support high availability for enterprise use cases when deployed to production (Deployment (Red Hat OpenShift)).</w:t>
-      </w:r>
-    </w:p>
-    <w:p>
-      <w:pPr>
-        <w:spacing w:after="120"/>
-      </w:pPr>
-      <w:r>
-        <w:t>NFR8 Data retention: Configurable retention and deletion policies for proprietary documents (Watson Discovery + IBM Cloud storage policies).</w:t>
+        <w:ind w:left="216" w:hanging="216"/>
+      </w:pPr>
+      <w:r>
+        <w:rPr>
+          <w:rStyle w:val="ReqID"/>
+        </w:rPr>
+        <w:t xml:space="preserve">NFR-SEC-01 </w:t>
+      </w:r>
+      <w:r>
+        <w:t>The system shall enforce least-privilege, role-based access control for facility documents, interview data, canonical state, and derived outputs.</w:t>
+      </w:r>
+    </w:p>
+    <w:p>
+      <w:pPr>
+        <w:ind w:left="216" w:hanging="216"/>
+      </w:pPr>
+      <w:r>
+        <w:rPr>
+          <w:rStyle w:val="ReqID"/>
+        </w:rPr>
+        <w:lastRenderedPageBreak/>
+        <w:t xml:space="preserve">NFR-SEC-02 </w:t>
+      </w:r>
+      <w:r>
+        <w:t>The system shall protect sensitive documents and derived data using encryption at rest and in transit.</w:t>
+      </w:r>
+    </w:p>
+    <w:p>
+      <w:pPr>
+        <w:ind w:left="216" w:hanging="216"/>
+      </w:pPr>
+      <w:r>
+        <w:rPr>
+          <w:rStyle w:val="ReqID"/>
+        </w:rPr>
+        <w:t xml:space="preserve">NFR-AUD-01 </w:t>
+      </w:r>
+      <w:r>
+        <w:t>The system shall log access, intake actions, model-generation runs, exports, and governance-relevant events for audit.</w:t>
+      </w:r>
+    </w:p>
+    <w:p>
+      <w:pPr>
+        <w:ind w:left="216" w:hanging="216"/>
+      </w:pPr>
+      <w:r>
+        <w:rPr>
+          <w:rStyle w:val="ReqID"/>
+        </w:rPr>
+        <w:t xml:space="preserve">NFR-TRC-01 </w:t>
+      </w:r>
+      <w:r>
+        <w:t>Each output parameter shall include provenance identifying a source document anchor, retrieval snippet, deterministic rule, explicit assumption, or documented conflict state.</w:t>
+      </w:r>
+    </w:p>
+    <w:p>
+      <w:pPr>
+        <w:ind w:left="216" w:hanging="216"/>
+      </w:pPr>
+      <w:r>
+        <w:rPr>
+          <w:rStyle w:val="ReqID"/>
+        </w:rPr>
+        <w:t xml:space="preserve">NFR-REP-01 </w:t>
+      </w:r>
+      <w:r>
+        <w:t>Given the same inputs, pinned system configuration, and applicable model versions, outputs shall be reproducible within documented tolerance.</w:t>
+      </w:r>
+    </w:p>
+    <w:p>
+      <w:pPr>
+        <w:ind w:left="216" w:hanging="216"/>
+      </w:pPr>
+      <w:r>
+        <w:rPr>
+          <w:rStyle w:val="ReqID"/>
+        </w:rPr>
+        <w:t xml:space="preserve">NFR-PERF-01 </w:t>
+      </w:r>
+      <w:r>
+        <w:t>For a representative submission set, the system shall produce an initial modeling packet within an operationally acceptable timeframe for engineering workflow.</w:t>
+      </w:r>
+    </w:p>
+    <w:p>
+      <w:pPr>
+        <w:ind w:left="216" w:hanging="216"/>
+      </w:pPr>
+      <w:r>
+        <w:rPr>
+          <w:rStyle w:val="ReqID"/>
+        </w:rPr>
+        <w:t xml:space="preserve">NFR-AVL-01 </w:t>
+      </w:r>
+      <w:r>
+        <w:t>The production deployment shall support enterprise-appropriate availability and recovery characteristics.</w:t>
+      </w:r>
+    </w:p>
+    <w:p>
+      <w:pPr>
+        <w:ind w:left="216" w:hanging="216"/>
+      </w:pPr>
+      <w:r>
+        <w:rPr>
+          <w:rStyle w:val="ReqID"/>
+        </w:rPr>
+        <w:t xml:space="preserve">NFR-RET-01 </w:t>
+      </w:r>
+      <w:r>
+        <w:t>The system shall support configurable retention and deletion policies for proprietary project data, artifacts, and exports.</w:t>
+      </w:r>
+    </w:p>
+    <w:p>
+      <w:pPr>
+        <w:ind w:left="216" w:hanging="216"/>
+      </w:pPr>
+      <w:r>
+        <w:rPr>
+          <w:rStyle w:val="ReqID"/>
+        </w:rPr>
+        <w:t xml:space="preserve">NFR-GOV-01 </w:t>
+      </w:r>
+      <w:r>
+        <w:t>Interactive intake sessions shall store structured question and answer state and summaries suitable for reproducible processing without relying on raw conversational history as the primary LLM context.</w:t>
+      </w:r>
+    </w:p>
+    <w:p>
+      <w:pPr>
+        <w:ind w:left="216" w:hanging="216"/>
+      </w:pPr>
+      <w:r>
+        <w:rPr>
+          <w:rStyle w:val="ReqID"/>
+        </w:rPr>
+        <w:t xml:space="preserve">NFR-GOV-02 </w:t>
+      </w:r>
+      <w:r>
+        <w:t>When contradictory information is detected across user responses, project documents, or retrieved references, the system shall preserve the conflict in run records and planner-facing outputs until resolved.</w:t>
+      </w:r>
+    </w:p>
+    <w:p>
+      <w:pPr>
+        <w:ind w:left="216" w:hanging="216"/>
+      </w:pPr>
+      <w:r>
+        <w:rPr>
+          <w:rStyle w:val="ReqID"/>
+        </w:rPr>
+        <w:t xml:space="preserve">NFR-AI-01 </w:t>
+      </w:r>
+      <w:r>
+        <w:t>LLM-assisted behavior shall remain bounded, auditable, and subordinate to deterministic validation and canonical-state governance.</w:t>
+      </w:r>
+    </w:p>
+    <w:p>
+      <w:pPr>
+        <w:ind w:left="216" w:hanging="216"/>
+      </w:pPr>
+      <w:r>
+        <w:rPr>
+          <w:rStyle w:val="ReqID"/>
+        </w:rPr>
+        <w:t xml:space="preserve">NFR-AI-02 </w:t>
+      </w:r>
+      <w:r>
+        <w:t>The system shall not fabricate engineering facts when evidence is absent; uncertainty shall be expressed through gaps, assumptions, bounds, or review-required states.</w:t>
+      </w:r>
+    </w:p>
+    <w:p>
+      <w:pPr>
+        <w:ind w:left="216" w:hanging="216"/>
+      </w:pPr>
+      <w:r>
+        <w:rPr>
+          <w:rStyle w:val="ReqID"/>
+        </w:rPr>
+        <w:t xml:space="preserve">NFR-DAT-01 </w:t>
+      </w:r>
+      <w:r>
+        <w:t>Canonical-state, schema, and run-lineage records shall be persisted in a manner that supports traceability, replay, and controlled evolution over time.</w:t>
       </w:r>
     </w:p>
     <w:p>
@@ -534,91 +1389,203 @@
         <w:pStyle w:val="Heading1"/>
       </w:pPr>
       <w:r>
-        <w:t>6. AI and RAG Architecture</w:t>
-      </w:r>
-    </w:p>
-    <w:p>
-      <w:pPr>
-        <w:spacing w:after="120"/>
-      </w:pPr>
-      <w:proofErr w:type="spellStart"/>
-      <w:r>
-        <w:t>GridSenpAI</w:t>
-      </w:r>
-      <w:proofErr w:type="spellEnd"/>
-      <w:r>
-        <w:t xml:space="preserve"> uses an AI pipeline where document retrieval provides grounded context for parameter extraction and translation. RAG (IBM Watson Discovery + watsonx.ai) is used to locate relevant specification passages and modeling rules; watsonx.ai performs structured extraction and translation into the output schema.</w:t>
-      </w:r>
-    </w:p>
-    <w:p>
-      <w:pPr>
-        <w:pStyle w:val="Heading2"/>
-      </w:pPr>
-      <w:r>
-        <w:t>6.1 Knowledge Bases</w:t>
-      </w:r>
-    </w:p>
-    <w:p>
-      <w:pPr>
-        <w:pStyle w:val="ListBullet"/>
-        <w:spacing w:after="40"/>
-      </w:pPr>
-      <w:r>
-        <w:t>Vendor spec corpus (UPS, generators, transformers, switchgear, relays, VFDs) indexed for search and vector retrieval (Watson Discovery).</w:t>
-      </w:r>
-    </w:p>
-    <w:p>
-      <w:pPr>
-        <w:pStyle w:val="ListBullet"/>
-        <w:spacing w:after="40"/>
+        <w:t>6. AI and RAG Architecture Requirements</w:t>
+      </w:r>
+    </w:p>
+    <w:p>
+      <w:r>
+        <w:t>GridSenpAI uses a grounded AI pipeline in which retrieval provides context for extraction, translation, clarification, and parameter inference. LLM behavior must remain bounded by schema enforcement, deterministic validation, provenance requirements, and canonical-state governance.</w:t>
+      </w:r>
+    </w:p>
+    <w:p>
+      <w:pPr>
+        <w:ind w:left="360" w:hanging="259"/>
+      </w:pPr>
+      <w:r>
+        <w:rPr>
+          <w:b/>
+        </w:rPr>
+        <w:t xml:space="preserve">• </w:t>
+      </w:r>
+      <w:r>
+        <w:t>The vendor specification corpus shall support search and retrieval over major electrical and mechanical load-driving equipment.</w:t>
+      </w:r>
+    </w:p>
+    <w:p>
+      <w:pPr>
+        <w:ind w:left="360" w:hanging="259"/>
+      </w:pPr>
+      <w:r>
+        <w:rPr>
+          <w:b/>
+        </w:rPr>
+        <w:t xml:space="preserve">• </w:t>
+      </w:r>
+      <w:r>
+        <w:t>The modeling reference corpus shall support search and retrieval over applicable standards, templates, modeling guidance, and parameter references.</w:t>
+      </w:r>
+    </w:p>
+    <w:p>
+      <w:pPr>
+        <w:ind w:left="360" w:hanging="259"/>
+      </w:pPr>
+      <w:r>
+        <w:rPr>
+          <w:b/>
+        </w:rPr>
+        <w:t xml:space="preserve">• </w:t>
+      </w:r>
+      <w:r>
+        <w:t>Terminology mappings, question templates, field dependencies, and parameter dictionaries shall be versioned governed content.</w:t>
+      </w:r>
+    </w:p>
+    <w:p>
+      <w:pPr>
+        <w:ind w:left="360" w:hanging="259"/>
+      </w:pPr>
+      <w:r>
+        <w:rPr>
+          <w:b/>
+        </w:rPr>
+        <w:t xml:space="preserve">• </w:t>
+      </w:r>
+      <w:r>
+        <w:t>Scenario outputs shall include bounds and confidence tags rather than unsupported single-point claims.</w:t>
+      </w:r>
+    </w:p>
+    <w:p>
+      <w:pPr>
+        <w:pStyle w:val="Heading1"/>
       </w:pPr>
       <w:r>
         <w:lastRenderedPageBreak/>
-        <w:t>Modeling reference corpus (IEEE/CIGRE guidance, ISO templates, tool parameter references) indexed similarly (Watson Discovery).</w:t>
-      </w:r>
-    </w:p>
-    <w:p>
-      <w:pPr>
-        <w:pStyle w:val="ListBullet"/>
-        <w:spacing w:after="40"/>
-      </w:pPr>
-      <w:r>
-        <w:t>Internal mapping rules and parameter dictionary maintained as versioned content (Relational database (IBM Db2 / PostgreSQL)).</w:t>
-      </w:r>
-    </w:p>
-    <w:p>
-      <w:pPr>
-        <w:pStyle w:val="Heading2"/>
-      </w:pPr>
-      <w:r>
-        <w:t>6.2 Guardrails to Reduce Hallucination</w:t>
-      </w:r>
-    </w:p>
-    <w:p>
-      <w:pPr>
-        <w:pStyle w:val="ListBullet"/>
-        <w:spacing w:after="40"/>
-      </w:pPr>
-      <w:r>
-        <w:t>Parameter generation must cite evidence passages or explicitly mark an assumption.</w:t>
-      </w:r>
-    </w:p>
-    <w:p>
-      <w:pPr>
-        <w:pStyle w:val="ListBullet"/>
-        <w:spacing w:after="40"/>
-      </w:pPr>
-      <w:r>
-        <w:t>If required evidence cannot be retrieved, output must include a missing-data request rather than fabricate values.</w:t>
-      </w:r>
-    </w:p>
-    <w:p>
-      <w:pPr>
-        <w:pStyle w:val="ListBullet"/>
-        <w:spacing w:after="40"/>
-      </w:pPr>
-      <w:r>
-        <w:t>Scenario outputs must include bounds and confidence tags, not single-point claims without support.</w:t>
+        <w:t>7. Data Pipeline and State Flow</w:t>
+      </w:r>
+    </w:p>
+    <w:p>
+      <w:pPr>
+        <w:ind w:left="360" w:hanging="259"/>
+      </w:pPr>
+      <w:r>
+        <w:rPr>
+          <w:b/>
+        </w:rPr>
+        <w:t xml:space="preserve">• </w:t>
+      </w:r>
+      <w:r>
+        <w:t>Start or resume structured facility intake session.</w:t>
+      </w:r>
+    </w:p>
+    <w:p>
+      <w:pPr>
+        <w:ind w:left="360" w:hanging="259"/>
+      </w:pPr>
+      <w:r>
+        <w:rPr>
+          <w:b/>
+        </w:rPr>
+        <w:t xml:space="preserve">• </w:t>
+      </w:r>
+      <w:r>
+        <w:t>Ask targeted questions and capture structured answers with field-level provenance.</w:t>
+      </w:r>
+    </w:p>
+    <w:p>
+      <w:pPr>
+        <w:ind w:left="360" w:hanging="259"/>
+      </w:pPr>
+      <w:r>
+        <w:rPr>
+          <w:b/>
+        </w:rPr>
+        <w:t xml:space="preserve">• </w:t>
+      </w:r>
+      <w:r>
+        <w:t>Upload and ingest facility and interconnection artifacts.</w:t>
+      </w:r>
+    </w:p>
+    <w:p>
+      <w:pPr>
+        <w:ind w:left="360" w:hanging="259"/>
+      </w:pPr>
+      <w:r>
+        <w:rPr>
+          <w:b/>
+        </w:rPr>
+        <w:t xml:space="preserve">• </w:t>
+      </w:r>
+      <w:r>
+        <w:t>Parse documents, extract entities, and normalize values and units.</w:t>
+      </w:r>
+    </w:p>
+    <w:p>
+      <w:pPr>
+        <w:ind w:left="360" w:hanging="259"/>
+      </w:pPr>
+      <w:r>
+        <w:rPr>
+          <w:b/>
+        </w:rPr>
+        <w:t xml:space="preserve">• </w:t>
+      </w:r>
+      <w:r>
+        <w:t>Retrieve supporting vendor, standards, and modeling references.</w:t>
+      </w:r>
+    </w:p>
+    <w:p>
+      <w:pPr>
+        <w:ind w:left="360" w:hanging="259"/>
+      </w:pPr>
+      <w:r>
+        <w:rPr>
+          <w:b/>
+        </w:rPr>
+        <w:t xml:space="preserve">• </w:t>
+      </w:r>
+      <w:r>
+        <w:t>Compute facility-equivalent composition, flags, and modeling inputs using translation rules.</w:t>
+      </w:r>
+    </w:p>
+    <w:p>
+      <w:pPr>
+        <w:ind w:left="360" w:hanging="259"/>
+      </w:pPr>
+      <w:r>
+        <w:rPr>
+          <w:b/>
+        </w:rPr>
+        <w:t xml:space="preserve">• </w:t>
+      </w:r>
+      <w:r>
+        <w:t>Generate output parameters and scenario variants with provenance and confidence.</w:t>
+      </w:r>
+    </w:p>
+    <w:p>
+      <w:pPr>
+        <w:ind w:left="360" w:hanging="259"/>
+      </w:pPr>
+      <w:r>
+        <w:rPr>
+          <w:b/>
+        </w:rPr>
+        <w:t xml:space="preserve">• </w:t>
+      </w:r>
+      <w:r>
+        <w:t>Package outputs for planner consumption and archive the run with version metadata.</w:t>
+      </w:r>
+    </w:p>
+    <w:p>
+      <w:pPr>
+        <w:ind w:left="360" w:hanging="259"/>
+      </w:pPr>
+      <w:r>
+        <w:rPr>
+          <w:b/>
+        </w:rPr>
+        <w:t xml:space="preserve">• </w:t>
+      </w:r>
+      <w:r>
+        <w:t>Persist interview state, canonical facility state, evidence bundle, and export lineage for review and reruns.</w:t>
       </w:r>
     </w:p>
     <w:p>
@@ -626,74 +1593,22 @@
         <w:pStyle w:val="Heading1"/>
       </w:pPr>
       <w:r>
-        <w:t>7. Data Pipeline</w:t>
-      </w:r>
-    </w:p>
-    <w:p>
-      <w:pPr>
-        <w:pStyle w:val="ListNumber"/>
-        <w:spacing w:after="40"/>
-      </w:pPr>
-      <w:r>
-        <w:t xml:space="preserve">Upload/ingest facility artifacts. Document </w:t>
-      </w:r>
-      <w:proofErr w:type="gramStart"/>
-      <w:r>
-        <w:t>ingestion</w:t>
-      </w:r>
-      <w:proofErr w:type="gramEnd"/>
-      <w:r>
-        <w:t xml:space="preserve"> (IBM Watson Discovery).</w:t>
-      </w:r>
-    </w:p>
-    <w:p>
-      <w:pPr>
-        <w:pStyle w:val="ListNumber"/>
-        <w:spacing w:after="40"/>
-      </w:pPr>
-      <w:r>
-        <w:t>Parse documents, extract entities, and normalize values/units. Document parsing (IBM Watson Discovery + watsonx.ai).</w:t>
-      </w:r>
-    </w:p>
-    <w:p>
-      <w:pPr>
-        <w:pStyle w:val="ListNumber"/>
-        <w:spacing w:after="40"/>
-      </w:pPr>
-      <w:r>
-        <w:t>Retrieve supporting vendor/modeling references. RAG (IBM Watson Discovery + watsonx.ai).</w:t>
-      </w:r>
-    </w:p>
-    <w:p>
-      <w:pPr>
-        <w:pStyle w:val="ListNumber"/>
-        <w:spacing w:after="40"/>
-      </w:pPr>
-      <w:proofErr w:type="gramStart"/>
-      <w:r>
-        <w:t>Compute</w:t>
-      </w:r>
-      <w:proofErr w:type="gramEnd"/>
-      <w:r>
-        <w:t xml:space="preserve"> facility equivalent composition and behavioral flags using translation rules.</w:t>
-      </w:r>
-    </w:p>
-    <w:p>
-      <w:pPr>
-        <w:pStyle w:val="ListNumber"/>
-        <w:spacing w:after="40"/>
-      </w:pPr>
-      <w:r>
-        <w:t>Generate output parameters and scenario variants; attach provenance and confidence.</w:t>
-      </w:r>
-    </w:p>
-    <w:p>
-      <w:pPr>
-        <w:pStyle w:val="ListNumber"/>
-        <w:spacing w:after="40"/>
-      </w:pPr>
-      <w:r>
-        <w:t>Package outputs for TP consumption and archive the run with version metadata.</w:t>
+        <w:t>8. Data Schemas and Canonical Data Requirements</w:t>
+      </w:r>
+    </w:p>
+    <w:p>
+      <w:r>
+        <w:t>GridSenpAI shall implement and enforce GridSenpAI_inputs_schema.json and GridSenpAI_outputs_schema.json. Validation rules including required fields, units, ranges, and status flags shall be applied at ingestion, during intake, during normalization, and before export.</w:t>
+      </w:r>
+    </w:p>
+    <w:p>
+      <w:r>
+        <w:t>The input schema shall be capable of representing both document-derived values and interview-confirmed values, along with field status metadata such as confirmed, inferred, assumed, conflicting, missing, and review-required.</w:t>
+      </w:r>
+    </w:p>
+    <w:p>
+      <w:r>
+        <w:t>The canonical facility state shall support field-level provenance, confidence, and lineage so that downstream outputs remain explainable and reproducible.</w:t>
       </w:r>
     </w:p>
     <w:p>
@@ -701,52 +1616,12 @@
         <w:pStyle w:val="Heading1"/>
       </w:pPr>
       <w:r>
-        <w:t>8. Data Schemas</w:t>
-      </w:r>
-    </w:p>
-    <w:p>
-      <w:pPr>
-        <w:spacing w:after="120"/>
-      </w:pPr>
-      <w:proofErr w:type="spellStart"/>
-      <w:r>
-        <w:t>GridSenpAI</w:t>
-      </w:r>
-      <w:proofErr w:type="spellEnd"/>
-      <w:r>
-        <w:t xml:space="preserve"> shall implement and enforce the input and output schemas previously defined (</w:t>
-      </w:r>
-      <w:proofErr w:type="spellStart"/>
-      <w:r>
-        <w:t>GridSenpAI</w:t>
-      </w:r>
-      <w:r>
-        <w:t>_inputs_</w:t>
-      </w:r>
-      <w:proofErr w:type="gramStart"/>
-      <w:r>
-        <w:t>schema.json</w:t>
-      </w:r>
-      <w:proofErr w:type="spellEnd"/>
-      <w:proofErr w:type="gramEnd"/>
-      <w:r>
-        <w:t xml:space="preserve"> and </w:t>
-      </w:r>
-      <w:proofErr w:type="spellStart"/>
-      <w:r>
-        <w:t>GridSenpAI</w:t>
-      </w:r>
-      <w:r>
-        <w:t>_outputs_</w:t>
-      </w:r>
-      <w:proofErr w:type="gramStart"/>
-      <w:r>
-        <w:t>schema.json</w:t>
-      </w:r>
-      <w:proofErr w:type="spellEnd"/>
-      <w:proofErr w:type="gramEnd"/>
-      <w:r>
-        <w:t>). Schema validation rules (required fields, units, ranges) shall be implemented at ingestion and pre-export.</w:t>
+        <w:t>9. Validation and Calibration</w:t>
+      </w:r>
+    </w:p>
+    <w:p>
+      <w:r>
+        <w:t>GridSenpAI shall support iterative refinement by incorporating commissioning results, telemetry, or later engineering evidence to update parameters, reduce bounds, and increase confidence while preserving version history and auditability.</w:t>
       </w:r>
     </w:p>
     <w:p>
@@ -754,20 +1629,63 @@
         <w:pStyle w:val="Heading1"/>
       </w:pPr>
       <w:r>
-        <w:t>9. Validation and Calibration</w:t>
-      </w:r>
-    </w:p>
-    <w:p>
-      <w:pPr>
-        <w:spacing w:after="120"/>
-      </w:pPr>
-      <w:proofErr w:type="spellStart"/>
-      <w:r>
-        <w:t>GridSenpAI</w:t>
-      </w:r>
-      <w:proofErr w:type="spellEnd"/>
-      <w:r>
-        <w:t xml:space="preserve"> shall support iterative refinement by incorporating commissioning results and/or telemetry (where available) to update parameters, reduce bounds, and increase confidence. This workflow must preserve version history and auditability.</w:t>
+        <w:t>10. Security and Compliance</w:t>
+      </w:r>
+    </w:p>
+    <w:p>
+      <w:pPr>
+        <w:ind w:left="360" w:hanging="259"/>
+      </w:pPr>
+      <w:r>
+        <w:rPr>
+          <w:b/>
+        </w:rPr>
+        <w:t xml:space="preserve">• </w:t>
+      </w:r>
+      <w:r>
+        <w:t>Sensitive document storage with encryption at rest and in transit.</w:t>
+      </w:r>
+    </w:p>
+    <w:p>
+      <w:pPr>
+        <w:ind w:left="360" w:hanging="259"/>
+      </w:pPr>
+      <w:r>
+        <w:rPr>
+          <w:b/>
+        </w:rPr>
+        <w:t xml:space="preserve">• </w:t>
+      </w:r>
+      <w:r>
+        <w:t>Fine-grained access control and project-level isolation.</w:t>
+      </w:r>
+    </w:p>
+    <w:p>
+      <w:pPr>
+        <w:ind w:left="360" w:hanging="259"/>
+      </w:pPr>
+      <w:r>
+        <w:rPr>
+          <w:b/>
+        </w:rPr>
+        <w:t xml:space="preserve">• </w:t>
+      </w:r>
+      <w:r>
+        <w:t>Audit logging for access, export, intake, and model-generation actions.</w:t>
+      </w:r>
+    </w:p>
+    <w:p>
+      <w:pPr>
+        <w:ind w:left="360" w:hanging="259"/>
+      </w:pPr>
+      <w:r>
+        <w:rPr>
+          <w:b/>
+        </w:rPr>
+        <w:t xml:space="preserve">• </w:t>
+      </w:r>
+      <w:r>
+        <w:t>Secure handling of credentials, tokens, and secrets for integrations.</w:t>
       </w:r>
     </w:p>
     <w:p>
@@ -775,117 +1693,125 @@
         <w:pStyle w:val="Heading1"/>
       </w:pPr>
       <w:r>
-        <w:t>10. Security and Compliance</w:t>
-      </w:r>
-    </w:p>
-    <w:p>
-      <w:pPr>
-        <w:pStyle w:val="ListBullet"/>
-        <w:spacing w:after="40"/>
-      </w:pPr>
-      <w:r>
-        <w:t>Sensitive document storage with encryption at rest and in transit (IBM Cloud Object Storage + IBM Key Protect).</w:t>
-      </w:r>
-    </w:p>
-    <w:p>
-      <w:pPr>
-        <w:pStyle w:val="ListBullet"/>
-        <w:spacing w:after="40"/>
-      </w:pPr>
-      <w:r>
-        <w:t>Fine-grained access control and project-level isolation (IBM Cloud IAM).</w:t>
-      </w:r>
-    </w:p>
-    <w:p>
-      <w:pPr>
-        <w:pStyle w:val="ListBullet"/>
-        <w:spacing w:after="40"/>
-      </w:pPr>
-      <w:r>
-        <w:t xml:space="preserve">Audit logging for access, export, and model-generation actions (IBM </w:t>
-      </w:r>
-      <w:proofErr w:type="spellStart"/>
-      <w:r>
-        <w:t>Instana</w:t>
-      </w:r>
-      <w:proofErr w:type="spellEnd"/>
-      <w:r>
-        <w:t xml:space="preserve"> / IBM Log Analysis).</w:t>
-      </w:r>
-    </w:p>
-    <w:p>
-      <w:pPr>
-        <w:pStyle w:val="ListBullet"/>
-        <w:spacing w:after="40"/>
-      </w:pPr>
-      <w:r>
+        <w:t>11. Acceptance Criteria</w:t>
+      </w:r>
+    </w:p>
+    <w:p>
+      <w:pPr>
+        <w:ind w:left="360" w:hanging="259"/>
+      </w:pPr>
+      <w:r>
+        <w:rPr>
+          <w:b/>
+        </w:rPr>
+        <w:t xml:space="preserve">• </w:t>
+      </w:r>
+      <w:r>
+        <w:t>Given a representative facility submission, GridSenpAI can begin a governed intake session, ask targeted engineering questions, validate structured responses, and persist them against canonical schema fields.</w:t>
+      </w:r>
+    </w:p>
+    <w:p>
+      <w:pPr>
+        <w:ind w:left="360" w:hanging="259"/>
+      </w:pPr>
+      <w:r>
+        <w:rPr>
+          <w:b/>
+        </w:rPr>
+        <w:t xml:space="preserve">• </w:t>
+      </w:r>
+      <w:r>
+        <w:t>Document-derived evidence and user-confirmed interview answers merge into one canonical facility state without duplicating already-confirmed fields.</w:t>
+      </w:r>
+    </w:p>
+    <w:p>
+      <w:pPr>
+        <w:ind w:left="360" w:hanging="259"/>
+      </w:pPr>
+      <w:r>
+        <w:rPr>
+          <w:b/>
+        </w:rPr>
         <w:lastRenderedPageBreak/>
-        <w:t>Secrets handling for system integrations (IBM Secrets Manager).</w:t>
-      </w:r>
-    </w:p>
-    <w:p>
-      <w:pPr>
-        <w:pStyle w:val="Heading1"/>
-      </w:pPr>
-      <w:r>
-        <w:t>11. Acceptance Criteria</w:t>
-      </w:r>
-    </w:p>
-    <w:p>
-      <w:pPr>
-        <w:pStyle w:val="ListBullet"/>
-        <w:spacing w:after="40"/>
-      </w:pPr>
-      <w:r>
-        <w:t xml:space="preserve">Given a representative facility submission, </w:t>
-      </w:r>
-      <w:proofErr w:type="spellStart"/>
-      <w:r>
-        <w:t>GridSenpAI</w:t>
-      </w:r>
-      <w:proofErr w:type="spellEnd"/>
-      <w:r>
-        <w:t xml:space="preserve"> produces a TP-ready parameter packet with scenario bounds and confidence tags.</w:t>
-      </w:r>
-    </w:p>
-    <w:p>
-      <w:pPr>
-        <w:pStyle w:val="ListBullet"/>
-        <w:spacing w:after="40"/>
-      </w:pPr>
-      <w:r>
-        <w:t>Every derived parameter links to evidence or a documented rule/assumption.</w:t>
-      </w:r>
-    </w:p>
-    <w:p>
-      <w:pPr>
-        <w:pStyle w:val="ListBullet"/>
-        <w:spacing w:after="40"/>
-      </w:pPr>
-      <w:r>
-        <w:t>System produces a missing-information list when required inputs are absent.</w:t>
-      </w:r>
-    </w:p>
-    <w:p>
-      <w:pPr>
-        <w:pStyle w:val="ListBullet"/>
-        <w:spacing w:after="40"/>
-      </w:pPr>
-      <w:r>
-        <w:t xml:space="preserve">Exports are consistent with the output </w:t>
-      </w:r>
-      <w:proofErr w:type="gramStart"/>
-      <w:r>
-        <w:t>schema</w:t>
-      </w:r>
-      <w:proofErr w:type="gramEnd"/>
-      <w:r>
-        <w:t xml:space="preserve"> and are usable in planner workflows.</w:t>
+        <w:t xml:space="preserve">• </w:t>
+      </w:r>
+      <w:r>
+        <w:t>The knowledge base can retrieve relevant references for major electrical and mechanical load-driving equipment and applicable planning/modeling guidance.</w:t>
+      </w:r>
+    </w:p>
+    <w:p>
+      <w:pPr>
+        <w:ind w:left="360" w:hanging="259"/>
+      </w:pPr>
+      <w:r>
+        <w:rPr>
+          <w:b/>
+        </w:rPr>
+        <w:t xml:space="preserve">• </w:t>
+      </w:r>
+      <w:r>
+        <w:t>Given a representative facility submission, GridSenpAI produces a planner-ready parameter packet with scenario bounds, confidence tags, assumptions, unresolved gaps, and review-required conflicts.</w:t>
+      </w:r>
+    </w:p>
+    <w:p>
+      <w:pPr>
+        <w:ind w:left="360" w:hanging="259"/>
+      </w:pPr>
+      <w:r>
+        <w:rPr>
+          <w:b/>
+        </w:rPr>
+        <w:t xml:space="preserve">• </w:t>
+      </w:r>
+      <w:r>
+        <w:t>Every derived parameter links to evidence, a deterministic rule, an explicit assumption, or a documented conflict state.</w:t>
+      </w:r>
+    </w:p>
+    <w:p>
+      <w:pPr>
+        <w:ind w:left="360" w:hanging="259"/>
+      </w:pPr>
+      <w:r>
+        <w:rPr>
+          <w:b/>
+        </w:rPr>
+        <w:t xml:space="preserve">• </w:t>
+      </w:r>
+      <w:r>
+        <w:t>The system produces a missing-information list when required inputs are absent or insufficiently supported.</w:t>
+      </w:r>
+    </w:p>
+    <w:p>
+      <w:pPr>
+        <w:ind w:left="360" w:hanging="259"/>
+      </w:pPr>
+      <w:r>
+        <w:rPr>
+          <w:b/>
+        </w:rPr>
+        <w:t xml:space="preserve">• </w:t>
+      </w:r>
+      <w:r>
+        <w:t>Exports are consistent with the output schema and usable within planner workflows.</w:t>
+      </w:r>
+    </w:p>
+    <w:p>
+      <w:pPr>
+        <w:ind w:left="360" w:hanging="259"/>
+      </w:pPr>
+      <w:r>
+        <w:rPr>
+          <w:b/>
+        </w:rPr>
+        <w:t xml:space="preserve">• </w:t>
+      </w:r>
+      <w:r>
+        <w:t>Reruns with updated inputs produce versioned outputs and a changelog of parameter differences.</w:t>
       </w:r>
     </w:p>
     <w:sectPr>
       <w:pgSz w:w="12240" w:h="15840"/>
-      <w:pgMar w:top="1440" w:right="1800" w:bottom="1440" w:left="1800" w:header="720" w:footer="720" w:gutter="0"/>
+      <w:pgMar w:top="1152" w:right="1296" w:bottom="1152" w:left="1296" w:header="720" w:footer="720" w:gutter="0"/>
       <w:cols w:space="720"/>
       <w:docGrid w:linePitch="360"/>
     </w:sectPr>
@@ -1066,31 +1992,31 @@
       </w:rPr>
     </w:lvl>
   </w:abstractNum>
-  <w:num w:numId="1" w16cid:durableId="874195100">
+  <w:num w:numId="1" w16cid:durableId="1826360556">
     <w:abstractNumId w:val="8"/>
   </w:num>
-  <w:num w:numId="2" w16cid:durableId="667294051">
+  <w:num w:numId="2" w16cid:durableId="863519803">
     <w:abstractNumId w:val="6"/>
   </w:num>
-  <w:num w:numId="3" w16cid:durableId="318849453">
+  <w:num w:numId="3" w16cid:durableId="181747670">
     <w:abstractNumId w:val="5"/>
   </w:num>
-  <w:num w:numId="4" w16cid:durableId="268785128">
+  <w:num w:numId="4" w16cid:durableId="2028406901">
     <w:abstractNumId w:val="4"/>
   </w:num>
-  <w:num w:numId="5" w16cid:durableId="419185625">
+  <w:num w:numId="5" w16cid:durableId="850988761">
     <w:abstractNumId w:val="7"/>
   </w:num>
-  <w:num w:numId="6" w16cid:durableId="443767617">
+  <w:num w:numId="6" w16cid:durableId="1039818838">
     <w:abstractNumId w:val="3"/>
   </w:num>
-  <w:num w:numId="7" w16cid:durableId="1072702340">
+  <w:num w:numId="7" w16cid:durableId="2019768782">
     <w:abstractNumId w:val="2"/>
   </w:num>
-  <w:num w:numId="8" w16cid:durableId="972712403">
+  <w:num w:numId="8" w16cid:durableId="2128573478">
     <w:abstractNumId w:val="1"/>
   </w:num>
-  <w:num w:numId="9" w16cid:durableId="135535187">
+  <w:num w:numId="9" w16cid:durableId="2096783949">
     <w:abstractNumId w:val="0"/>
   </w:num>
 </w:numbering>
@@ -1486,8 +2412,12 @@
     <w:name w:val="Normal"/>
     <w:qFormat/>
     <w:rsid w:val="00FC693F"/>
+    <w:pPr>
+      <w:spacing w:after="120" w:line="269" w:lineRule="auto"/>
+    </w:pPr>
     <w:rPr>
-      <w:rFonts w:ascii="Calibri" w:eastAsia="Calibri" w:hAnsi="Calibri"/>
+      <w:rFonts w:ascii="Arial" w:hAnsi="Arial"/>
+      <w:sz w:val="21"/>
     </w:rPr>
   </w:style>
   <w:style w:type="paragraph" w:styleId="Heading1">
@@ -1501,15 +2431,15 @@
     <w:pPr>
       <w:keepNext/>
       <w:keepLines/>
-      <w:spacing w:before="480" w:after="0"/>
+      <w:spacing w:before="240"/>
       <w:outlineLvl w:val="0"/>
     </w:pPr>
     <w:rPr>
       <w:rFonts w:asciiTheme="majorHAnsi" w:eastAsiaTheme="majorEastAsia" w:hAnsiTheme="majorHAnsi" w:cstheme="majorBidi"/>
       <w:b/>
       <w:bCs/>
-      <w:color w:val="365F91" w:themeColor="accent1" w:themeShade="BF"/>
-      <w:sz w:val="28"/>
+      <w:color w:val="1F4E79"/>
+      <w:sz w:val="30"/>
       <w:szCs w:val="28"/>
     </w:rPr>
   </w:style>
@@ -1525,15 +2455,15 @@
     <w:pPr>
       <w:keepNext/>
       <w:keepLines/>
-      <w:spacing w:before="200" w:after="0"/>
+      <w:spacing w:before="160" w:after="80"/>
       <w:outlineLvl w:val="1"/>
     </w:pPr>
     <w:rPr>
       <w:rFonts w:asciiTheme="majorHAnsi" w:eastAsiaTheme="majorEastAsia" w:hAnsiTheme="majorHAnsi" w:cstheme="majorBidi"/>
       <w:b/>
       <w:bCs/>
-      <w:color w:val="4F81BD" w:themeColor="accent1"/>
-      <w:sz w:val="26"/>
+      <w:color w:val="2F5496"/>
+      <w:sz w:val="24"/>
       <w:szCs w:val="26"/>
     </w:rPr>
   </w:style>
@@ -1556,7 +2486,7 @@
       <w:rFonts w:asciiTheme="majorHAnsi" w:eastAsiaTheme="majorEastAsia" w:hAnsiTheme="majorHAnsi" w:cstheme="majorBidi"/>
       <w:b/>
       <w:bCs/>
-      <w:color w:val="4F81BD" w:themeColor="accent1"/>
+      <w:color w:val="4472C4"/>
     </w:rPr>
   </w:style>
   <w:style w:type="paragraph" w:styleId="Heading4">
@@ -1839,10 +2769,11 @@
     </w:pPr>
     <w:rPr>
       <w:rFonts w:asciiTheme="majorHAnsi" w:eastAsiaTheme="majorEastAsia" w:hAnsiTheme="majorHAnsi" w:cstheme="majorBidi"/>
-      <w:color w:val="17365D" w:themeColor="text2" w:themeShade="BF"/>
+      <w:b/>
+      <w:color w:val="1F4E79"/>
       <w:spacing w:val="5"/>
       <w:kern w:val="28"/>
-      <w:sz w:val="52"/>
+      <w:sz w:val="44"/>
       <w:szCs w:val="52"/>
     </w:rPr>
   </w:style>
@@ -1918,9 +2849,6 @@
     <w:uiPriority w:val="99"/>
     <w:unhideWhenUsed/>
     <w:rsid w:val="00AA1D8D"/>
-    <w:pPr>
-      <w:spacing w:after="120"/>
-    </w:pPr>
   </w:style>
   <w:style w:type="character" w:customStyle="1" w:styleId="BodyTextChar">
     <w:name w:val="Body Text Char"/>
@@ -1937,7 +2865,7 @@
     <w:unhideWhenUsed/>
     <w:rsid w:val="00AA1D8D"/>
     <w:pPr>
-      <w:spacing w:after="120" w:line="480" w:lineRule="auto"/>
+      <w:spacing w:line="480" w:lineRule="auto"/>
     </w:pPr>
   </w:style>
   <w:style w:type="character" w:customStyle="1" w:styleId="BodyText2Char">
@@ -1954,9 +2882,6 @@
     <w:uiPriority w:val="99"/>
     <w:unhideWhenUsed/>
     <w:rsid w:val="00AA1D8D"/>
-    <w:pPr>
-      <w:spacing w:after="120"/>
-    </w:pPr>
     <w:rPr>
       <w:sz w:val="16"/>
       <w:szCs w:val="16"/>
@@ -2091,7 +3016,6 @@
     <w:unhideWhenUsed/>
     <w:rsid w:val="0029639D"/>
     <w:pPr>
-      <w:spacing w:after="120"/>
       <w:ind w:left="360"/>
       <w:contextualSpacing/>
     </w:pPr>
@@ -2103,7 +3027,6 @@
     <w:unhideWhenUsed/>
     <w:rsid w:val="0029639D"/>
     <w:pPr>
-      <w:spacing w:after="120"/>
       <w:ind w:left="720"/>
       <w:contextualSpacing/>
     </w:pPr>
@@ -2115,7 +3038,6 @@
     <w:unhideWhenUsed/>
     <w:rsid w:val="0029639D"/>
     <w:pPr>
-      <w:spacing w:after="120"/>
       <w:ind w:left="1080"/>
       <w:contextualSpacing/>
     </w:pPr>
@@ -12478,6 +13400,15 @@
         <w:shd w:val="clear" w:color="auto" w:fill="FBCAA2" w:themeFill="accent6" w:themeFillTint="7F"/>
       </w:tcPr>
     </w:tblStylePr>
+  </w:style>
+  <w:style w:type="character" w:customStyle="1" w:styleId="ReqID">
+    <w:name w:val="Req ID"/>
+    <w:rPr>
+      <w:rFonts w:ascii="Arial" w:hAnsi="Arial"/>
+      <w:b/>
+      <w:color w:val="1F4E79"/>
+      <w:sz w:val="21"/>
+    </w:rPr>
   </w:style>
 </w:styles>
 </file>

</xml_diff>